<commit_message>
Update Website design documentation.docx
</commit_message>
<xml_diff>
--- a/Design Documents/Website design documentation.docx
+++ b/Design Documents/Website design documentation.docx
@@ -194,6 +194,9 @@
     </w:p>
     <w:p>
       <w:r>
+        <w:rPr>
+          <w:noProof/>
+        </w:rPr>
         <w:drawing>
           <wp:inline distT="0" distB="0" distL="0" distR="0" wp14:anchorId="12253D17" wp14:editId="38A57304">
             <wp:extent cx="5731510" cy="4838700"/>
@@ -237,23 +240,27 @@
           <w:rPr>
             <w:rStyle w:val="Hyperlink"/>
           </w:rPr>
-          <w:t>https://chatgpt.com/share/694048da-a810-800a-a7b7-747</w:t>
-        </w:r>
-        <w:r>
-          <w:rPr>
-            <w:rStyle w:val="Hyperlink"/>
-          </w:rPr>
-          <w:t>7</w:t>
-        </w:r>
-        <w:r>
-          <w:rPr>
-            <w:rStyle w:val="Hyperlink"/>
-          </w:rPr>
-          <w:t>2518a776</w:t>
+          <w:t>https://chatgpt.com/share/694048da-a810-800a-a7b7-74772518a776</w:t>
         </w:r>
       </w:hyperlink>
     </w:p>
     <w:p/>
+    <w:p>
+      <w:r>
+        <w:t>This only covers the first week of website development.</w:t>
+      </w:r>
+    </w:p>
+    <w:p>
+      <w:r>
+        <w:t xml:space="preserve">Later website documentation can be found in my report and in the </w:t>
+      </w:r>
+      <w:r>
+        <w:t xml:space="preserve">README.md </w:t>
+      </w:r>
+      <w:r>
+        <w:t>s</w:t>
+      </w:r>
+    </w:p>
     <w:sectPr>
       <w:pgSz w:w="11906" w:h="16838"/>
       <w:pgMar w:top="1440" w:right="1440" w:bottom="1440" w:left="1440" w:header="708" w:footer="708" w:gutter="0"/>
@@ -867,6 +874,7 @@
   <w:style w:type="character" w:default="1" w:styleId="DefaultParagraphFont">
     <w:name w:val="Default Paragraph Font"/>
     <w:uiPriority w:val="1"/>
+    <w:semiHidden/>
     <w:unhideWhenUsed/>
   </w:style>
   <w:style w:type="table" w:default="1" w:styleId="TableNormal">

</xml_diff>